<commit_message>
PR5: remove Yandex Practicum section from report
</commit_message>
<xml_diff>
--- a/отчет/Отчет_ПР5_Майоров_ЭФБО-04-24.docx
+++ b/отчет/Отчет_ПР5_Майоров_ЭФБО-04-24.docx
@@ -935,122 +935,7 @@
           <w:b/>
           <w:bCs/>
         </w:rPr>
-        <w:t xml:space="preserve">2. Выполненные материалы Яндекс Практикума</w:t>
-      </w:r>
-    </w:p>
-    <w:p>
-      <w:pPr>
-        <w:spacing w:after="120" w:before="0"/>
-        <w:jc w:val="left"/>
-      </w:pPr>
-      <w:r>
-        <w:rPr>
-          <w:b w:val="false"/>
-          <w:bCs w:val="false"/>
-          <w:i w:val="false"/>
-          <w:iCs w:val="false"/>
-          <w:sz w:val="22"/>
-          <w:szCs w:val="22"/>
-        </w:rPr>
-        <w:t xml:space="preserve">Материалы проходятся самостоятельно в личном кабинете Яндекс Практикума (edu.mirea.ru); отметки о фактическом прохождении уроков и решении задач вносятся студентом в личном кабинете платформы и в чек-листе методических указаний.</w:t>
-      </w:r>
-    </w:p>
-    <w:tbl>
-      <w:tblPr>
-        <w:tblW w:type="dxa" w:w="9350"/>
-        <w:tblBorders>
-          <w:top w:val="single" w:color="auto" w:sz="4"/>
-          <w:left w:val="single" w:color="auto" w:sz="4"/>
-          <w:bottom w:val="single" w:color="auto" w:sz="4"/>
-          <w:right w:val="single" w:color="auto" w:sz="4"/>
-          <w:insideH w:val="single" w:color="auto" w:sz="4"/>
-          <w:insideV w:val="single" w:color="auto" w:sz="4"/>
-        </w:tblBorders>
-      </w:tblPr>
-      <w:tblGrid>
-        <w:gridCol w:w="3200"/>
-        <w:gridCol w:w="6150"/>
-      </w:tblGrid>
-      <w:tr>
-        <w:tc>
-          <w:tcPr>
-            <w:tcW w:type="dxa" w:w="3200"/>
-          </w:tcPr>
-          <w:p>
-            <w:r>
-              <w:rPr>
-                <w:b/>
-                <w:bCs/>
-                <w:sz w:val="20"/>
-                <w:szCs w:val="20"/>
-              </w:rPr>
-              <w:t xml:space="preserve">Раздел</w:t>
-            </w:r>
-          </w:p>
-        </w:tc>
-        <w:tc>
-          <w:tcPr>
-            <w:tcW w:type="dxa" w:w="6150"/>
-          </w:tcPr>
-          <w:p>
-            <w:r>
-              <w:rPr>
-                <w:b/>
-                <w:bCs/>
-                <w:sz w:val="20"/>
-                <w:szCs w:val="20"/>
-              </w:rPr>
-              <w:t xml:space="preserve">Тема курса, соответствующая заданию</w:t>
-            </w:r>
-          </w:p>
-        </w:tc>
-      </w:tr>
-      <w:tr>
-        <w:tc>
-          <w:tcPr>
-            <w:tcW w:type="dxa" w:w="3200"/>
-          </w:tcPr>
-          <w:p>
-            <w:r>
-              <w:rPr>
-                <w:b w:val="false"/>
-                <w:bCs w:val="false"/>
-                <w:sz w:val="20"/>
-                <w:szCs w:val="20"/>
-              </w:rPr>
-              <w:t xml:space="preserve">Раздел 04. «Основы веб-разработки»</w:t>
-            </w:r>
-          </w:p>
-        </w:tc>
-        <w:tc>
-          <w:tcPr>
-            <w:tcW w:type="dxa" w:w="6150"/>
-          </w:tcPr>
-          <w:p>
-            <w:r>
-              <w:rPr>
-                <w:b w:val="false"/>
-                <w:bCs w:val="false"/>
-                <w:sz w:val="20"/>
-                <w:szCs w:val="20"/>
-              </w:rPr>
-              <w:t xml:space="preserve">«Создание проекта» (введение в спринт, фреймворк Django, создание Django-проекта, приложения); «Пути и view-функции» (протокол HTTP, планирование адресов и конвертеры путей, распределение адресов по приложениям, view-функции); «Вёрстка для бэкендера» (HTML, структура документа, CSS, наследование стилей, Bootstrap)</w:t>
-            </w:r>
-          </w:p>
-        </w:tc>
-      </w:tr>
-    </w:tbl>
-    <w:p>
-      <w:pPr>
-        <w:pStyle w:val="Heading1"/>
-        <w:spacing w:after="120" w:before="240"/>
-      </w:pPr>
-      <w:r>
-        <w:rPr>
-          <w:b/>
-          <w:bCs/>
-        </w:rPr>
-        <w:t xml:space="preserve">3. Доработка индивидуального проекта</w:t>
+        <w:t xml:space="preserve">2. Доработка индивидуального проекта</w:t>
       </w:r>
     </w:p>
     <w:p>
@@ -1483,7 +1368,7 @@
           <w:b/>
           <w:bCs/>
         </w:rPr>
-        <w:t xml:space="preserve">4. Результат работы</w:t>
+        <w:t xml:space="preserve">3. Результат работы</w:t>
       </w:r>
     </w:p>
     <w:p>
@@ -1632,7 +1517,7 @@
           <w:b/>
           <w:bCs/>
         </w:rPr>
-        <w:t xml:space="preserve">5. Вывод</w:t>
+        <w:t xml:space="preserve">4. Вывод</w:t>
       </w:r>
     </w:p>
     <w:p>

</xml_diff>